<commit_message>
Correct Reddit source description to r/askscience; add log entry 17
</commit_message>
<xml_diff>
--- a/report/COEN542_Group4_Report.docx
+++ b/report/COEN542_Group4_Report.docx
@@ -938,6 +938,138 @@
           </w:p>
         </w:tc>
       </w:tr>
+      <w:tr>
+        <w:tc>
+          <w:tcPr>
+            <w:tcW w:type="dxa" w:w="2351"/>
+          </w:tcPr>
+          <w:p>
+            <w:pPr>
+              <w:spacing w:line="240" w:lineRule="auto"/>
+            </w:pPr>
+            <w:r>
+              <w:rPr>
+                <w:sz w:val="20"/>
+              </w:rPr>
+              <w:t>kafka_produce</w:t>
+            </w:r>
+          </w:p>
+        </w:tc>
+        <w:tc>
+          <w:tcPr>
+            <w:tcW w:type="dxa" w:w="2351"/>
+          </w:tcPr>
+          <w:p>
+            <w:pPr>
+              <w:spacing w:line="240" w:lineRule="auto"/>
+            </w:pPr>
+            <w:r>
+              <w:rPr>
+                <w:sz w:val="20"/>
+              </w:rPr>
+              <w:t>200,000</w:t>
+            </w:r>
+          </w:p>
+        </w:tc>
+        <w:tc>
+          <w:tcPr>
+            <w:tcW w:type="dxa" w:w="2351"/>
+          </w:tcPr>
+          <w:p>
+            <w:pPr>
+              <w:spacing w:line="240" w:lineRule="auto"/>
+            </w:pPr>
+            <w:r>
+              <w:rPr>
+                <w:sz w:val="20"/>
+              </w:rPr>
+              <w:t>30.04</w:t>
+            </w:r>
+          </w:p>
+        </w:tc>
+        <w:tc>
+          <w:tcPr>
+            <w:tcW w:type="dxa" w:w="2351"/>
+          </w:tcPr>
+          <w:p>
+            <w:pPr>
+              <w:spacing w:line="240" w:lineRule="auto"/>
+            </w:pPr>
+            <w:r>
+              <w:rPr>
+                <w:sz w:val="20"/>
+              </w:rPr>
+              <w:t>6,658.50</w:t>
+            </w:r>
+          </w:p>
+        </w:tc>
+      </w:tr>
+      <w:tr>
+        <w:tc>
+          <w:tcPr>
+            <w:tcW w:type="dxa" w:w="2351"/>
+          </w:tcPr>
+          <w:p>
+            <w:pPr>
+              <w:spacing w:line="240" w:lineRule="auto"/>
+            </w:pPr>
+            <w:r>
+              <w:rPr>
+                <w:sz w:val="20"/>
+              </w:rPr>
+              <w:t>kafka_consume_to_mongo</w:t>
+            </w:r>
+          </w:p>
+        </w:tc>
+        <w:tc>
+          <w:tcPr>
+            <w:tcW w:type="dxa" w:w="2351"/>
+          </w:tcPr>
+          <w:p>
+            <w:pPr>
+              <w:spacing w:line="240" w:lineRule="auto"/>
+            </w:pPr>
+            <w:r>
+              <w:rPr>
+                <w:sz w:val="20"/>
+              </w:rPr>
+              <w:t>200,000</w:t>
+            </w:r>
+          </w:p>
+        </w:tc>
+        <w:tc>
+          <w:tcPr>
+            <w:tcW w:type="dxa" w:w="2351"/>
+          </w:tcPr>
+          <w:p>
+            <w:pPr>
+              <w:spacing w:line="240" w:lineRule="auto"/>
+            </w:pPr>
+            <w:r>
+              <w:rPr>
+                <w:sz w:val="20"/>
+              </w:rPr>
+              <w:t>8.45</w:t>
+            </w:r>
+          </w:p>
+        </w:tc>
+        <w:tc>
+          <w:tcPr>
+            <w:tcW w:type="dxa" w:w="2351"/>
+          </w:tcPr>
+          <w:p>
+            <w:pPr>
+              <w:spacing w:line="240" w:lineRule="auto"/>
+            </w:pPr>
+            <w:r>
+              <w:rPr>
+                <w:sz w:val="20"/>
+              </w:rPr>
+              <w:t>23,663.60</w:t>
+            </w:r>
+          </w:p>
+        </w:tc>
+      </w:tr>
     </w:tbl>
     <w:p/>
     <w:p>
@@ -1084,7 +1216,7 @@
               <w:rPr>
                 <w:sz w:val="20"/>
               </w:rPr>
-              <w:t>32.83</w:t>
+              <w:t>31.68</w:t>
             </w:r>
           </w:p>
         </w:tc>
@@ -1100,7 +1232,7 @@
               <w:rPr>
                 <w:sz w:val="20"/>
               </w:rPr>
-              <w:t>46,829.70</w:t>
+              <w:t>48,521.00</w:t>
             </w:r>
           </w:p>
         </w:tc>
@@ -1150,7 +1282,7 @@
               <w:rPr>
                 <w:sz w:val="20"/>
               </w:rPr>
-              <w:t>66.21</w:t>
+              <w:t>64.72</w:t>
             </w:r>
           </w:p>
         </w:tc>
@@ -1166,7 +1298,7 @@
               <w:rPr>
                 <w:sz w:val="20"/>
               </w:rPr>
-              <w:t>46,417.40</w:t>
+              <w:t>47,483.70</w:t>
             </w:r>
           </w:p>
         </w:tc>
@@ -1216,7 +1348,7 @@
               <w:rPr>
                 <w:sz w:val="20"/>
               </w:rPr>
-              <w:t>115.24</w:t>
+              <w:t>109.25</w:t>
             </w:r>
           </w:p>
         </w:tc>
@@ -1232,7 +1364,7 @@
               <w:rPr>
                 <w:sz w:val="20"/>
               </w:rPr>
-              <w:t>53,318.50</w:t>
+              <w:t>56,243.80</w:t>
             </w:r>
           </w:p>
         </w:tc>
@@ -1244,7 +1376,7 @@
         <w:jc w:val="both"/>
       </w:pPr>
       <w:r>
-        <w:t>Loading the full corpus took 115.2 seconds for 6,144,625 documents, an average of 53,318 documents per second. The first slice ran at 46,830 documents per second and the last at 62,638, which shows how write throughput behaves as the collection and its indexes grow.</w:t>
+        <w:t>Loading the full corpus took 109.2 seconds for 6,144,625 documents, an average of 56,244 documents per second. The first slice ran at 48,521 documents per second and the last at 68,978, which shows how write throughput behaves as the collection and its indexes grow.</w:t>
       </w:r>
     </w:p>
     <w:p>
@@ -2061,7 +2193,7 @@
               <w:rPr>
                 <w:sz w:val="20"/>
               </w:rPr>
-              <w:t>60.02</w:t>
+              <w:t>60.04</w:t>
             </w:r>
           </w:p>
         </w:tc>
@@ -2095,7 +2227,7 @@
               <w:rPr>
                 <w:sz w:val="20"/>
               </w:rPr>
-              <w:t>iost</w:t>
+              <w:t>tokyo</w:t>
             </w:r>
           </w:p>
         </w:tc>
@@ -2127,7 +2259,7 @@
               <w:rPr>
                 <w:sz w:val="20"/>
               </w:rPr>
-              <w:t>302</w:t>
+              <w:t>844</w:t>
             </w:r>
           </w:p>
         </w:tc>
@@ -2143,7 +2275,7 @@
               <w:rPr>
                 <w:sz w:val="20"/>
               </w:rPr>
-              <w:t>2019-09</w:t>
+              <w:t>2021-07</w:t>
             </w:r>
           </w:p>
         </w:tc>
@@ -2159,7 +2291,7 @@
               <w:rPr>
                 <w:sz w:val="20"/>
               </w:rPr>
-              <w:t>58.74</w:t>
+              <w:t>59.64</w:t>
             </w:r>
           </w:p>
         </w:tc>
@@ -2291,202 +2423,6 @@
               <w:rPr>
                 <w:sz w:val="20"/>
               </w:rPr>
-              <w:t>blackrock</w:t>
-            </w:r>
-          </w:p>
-        </w:tc>
-        <w:tc>
-          <w:tcPr>
-            <w:tcW w:type="dxa" w:w="1568"/>
-          </w:tcPr>
-          <w:p>
-            <w:pPr>
-              <w:spacing w:line="240" w:lineRule="auto"/>
-            </w:pPr>
-            <w:r>
-              <w:rPr>
-                <w:sz w:val="20"/>
-              </w:rPr>
-              <w:t>twitter</w:t>
-            </w:r>
-          </w:p>
-        </w:tc>
-        <w:tc>
-          <w:tcPr>
-            <w:tcW w:type="dxa" w:w="1568"/>
-          </w:tcPr>
-          <w:p>
-            <w:pPr>
-              <w:spacing w:line="240" w:lineRule="auto"/>
-            </w:pPr>
-            <w:r>
-              <w:rPr>
-                <w:sz w:val="20"/>
-              </w:rPr>
-              <w:t>1,362</w:t>
-            </w:r>
-          </w:p>
-        </w:tc>
-        <w:tc>
-          <w:tcPr>
-            <w:tcW w:type="dxa" w:w="1568"/>
-          </w:tcPr>
-          <w:p>
-            <w:pPr>
-              <w:spacing w:line="240" w:lineRule="auto"/>
-            </w:pPr>
-            <w:r>
-              <w:rPr>
-                <w:sz w:val="20"/>
-              </w:rPr>
-              <w:t>2023-06</w:t>
-            </w:r>
-          </w:p>
-        </w:tc>
-        <w:tc>
-          <w:tcPr>
-            <w:tcW w:type="dxa" w:w="1568"/>
-          </w:tcPr>
-          <w:p>
-            <w:pPr>
-              <w:spacing w:line="240" w:lineRule="auto"/>
-            </w:pPr>
-            <w:r>
-              <w:rPr>
-                <w:sz w:val="20"/>
-              </w:rPr>
-              <w:t>58.72</w:t>
-            </w:r>
-          </w:p>
-        </w:tc>
-        <w:tc>
-          <w:tcPr>
-            <w:tcW w:type="dxa" w:w="1568"/>
-          </w:tcPr>
-          <w:p>
-            <w:pPr>
-              <w:spacing w:line="240" w:lineRule="auto"/>
-            </w:pPr>
-            <w:r>
-              <w:rPr>
-                <w:sz w:val="20"/>
-              </w:rPr>
-              <w:t>8.46</w:t>
-            </w:r>
-          </w:p>
-        </w:tc>
-      </w:tr>
-      <w:tr>
-        <w:tc>
-          <w:tcPr>
-            <w:tcW w:type="dxa" w:w="1568"/>
-          </w:tcPr>
-          <w:p>
-            <w:pPr>
-              <w:spacing w:line="240" w:lineRule="auto"/>
-            </w:pPr>
-            <w:r>
-              <w:rPr>
-                <w:sz w:val="20"/>
-              </w:rPr>
-              <w:t>tokyo</w:t>
-            </w:r>
-          </w:p>
-        </w:tc>
-        <w:tc>
-          <w:tcPr>
-            <w:tcW w:type="dxa" w:w="1568"/>
-          </w:tcPr>
-          <w:p>
-            <w:pPr>
-              <w:spacing w:line="240" w:lineRule="auto"/>
-            </w:pPr>
-            <w:r>
-              <w:rPr>
-                <w:sz w:val="20"/>
-              </w:rPr>
-              <w:t>twitter</w:t>
-            </w:r>
-          </w:p>
-        </w:tc>
-        <w:tc>
-          <w:tcPr>
-            <w:tcW w:type="dxa" w:w="1568"/>
-          </w:tcPr>
-          <w:p>
-            <w:pPr>
-              <w:spacing w:line="240" w:lineRule="auto"/>
-            </w:pPr>
-            <w:r>
-              <w:rPr>
-                <w:sz w:val="20"/>
-              </w:rPr>
-              <w:t>844</w:t>
-            </w:r>
-          </w:p>
-        </w:tc>
-        <w:tc>
-          <w:tcPr>
-            <w:tcW w:type="dxa" w:w="1568"/>
-          </w:tcPr>
-          <w:p>
-            <w:pPr>
-              <w:spacing w:line="240" w:lineRule="auto"/>
-            </w:pPr>
-            <w:r>
-              <w:rPr>
-                <w:sz w:val="20"/>
-              </w:rPr>
-              <w:t>2021-07</w:t>
-            </w:r>
-          </w:p>
-        </w:tc>
-        <w:tc>
-          <w:tcPr>
-            <w:tcW w:type="dxa" w:w="1568"/>
-          </w:tcPr>
-          <w:p>
-            <w:pPr>
-              <w:spacing w:line="240" w:lineRule="auto"/>
-            </w:pPr>
-            <w:r>
-              <w:rPr>
-                <w:sz w:val="20"/>
-              </w:rPr>
-              <w:t>59.63</w:t>
-            </w:r>
-          </w:p>
-        </w:tc>
-        <w:tc>
-          <w:tcPr>
-            <w:tcW w:type="dxa" w:w="1568"/>
-          </w:tcPr>
-          <w:p>
-            <w:pPr>
-              <w:spacing w:line="240" w:lineRule="auto"/>
-            </w:pPr>
-            <w:r>
-              <w:rPr>
-                <w:sz w:val="20"/>
-              </w:rPr>
-              <w:t>8.46</w:t>
-            </w:r>
-          </w:p>
-        </w:tc>
-      </w:tr>
-      <w:tr>
-        <w:tc>
-          <w:tcPr>
-            <w:tcW w:type="dxa" w:w="1568"/>
-          </w:tcPr>
-          <w:p>
-            <w:pPr>
-              <w:spacing w:line="240" w:lineRule="auto"/>
-            </w:pPr>
-            <w:r>
-              <w:rPr>
-                <w:sz w:val="20"/>
-              </w:rPr>
               <w:t>moneygram</w:t>
             </w:r>
           </w:p>
@@ -2552,6 +2488,202 @@
                 <w:sz w:val="20"/>
               </w:rPr>
               <w:t>60.34</w:t>
+            </w:r>
+          </w:p>
+        </w:tc>
+        <w:tc>
+          <w:tcPr>
+            <w:tcW w:type="dxa" w:w="1568"/>
+          </w:tcPr>
+          <w:p>
+            <w:pPr>
+              <w:spacing w:line="240" w:lineRule="auto"/>
+            </w:pPr>
+            <w:r>
+              <w:rPr>
+                <w:sz w:val="20"/>
+              </w:rPr>
+              <w:t>8.46</w:t>
+            </w:r>
+          </w:p>
+        </w:tc>
+      </w:tr>
+      <w:tr>
+        <w:tc>
+          <w:tcPr>
+            <w:tcW w:type="dxa" w:w="1568"/>
+          </w:tcPr>
+          <w:p>
+            <w:pPr>
+              <w:spacing w:line="240" w:lineRule="auto"/>
+            </w:pPr>
+            <w:r>
+              <w:rPr>
+                <w:sz w:val="20"/>
+              </w:rPr>
+              <w:t>blackrock</w:t>
+            </w:r>
+          </w:p>
+        </w:tc>
+        <w:tc>
+          <w:tcPr>
+            <w:tcW w:type="dxa" w:w="1568"/>
+          </w:tcPr>
+          <w:p>
+            <w:pPr>
+              <w:spacing w:line="240" w:lineRule="auto"/>
+            </w:pPr>
+            <w:r>
+              <w:rPr>
+                <w:sz w:val="20"/>
+              </w:rPr>
+              <w:t>twitter</w:t>
+            </w:r>
+          </w:p>
+        </w:tc>
+        <w:tc>
+          <w:tcPr>
+            <w:tcW w:type="dxa" w:w="1568"/>
+          </w:tcPr>
+          <w:p>
+            <w:pPr>
+              <w:spacing w:line="240" w:lineRule="auto"/>
+            </w:pPr>
+            <w:r>
+              <w:rPr>
+                <w:sz w:val="20"/>
+              </w:rPr>
+              <w:t>1,362</w:t>
+            </w:r>
+          </w:p>
+        </w:tc>
+        <w:tc>
+          <w:tcPr>
+            <w:tcW w:type="dxa" w:w="1568"/>
+          </w:tcPr>
+          <w:p>
+            <w:pPr>
+              <w:spacing w:line="240" w:lineRule="auto"/>
+            </w:pPr>
+            <w:r>
+              <w:rPr>
+                <w:sz w:val="20"/>
+              </w:rPr>
+              <w:t>2023-06</w:t>
+            </w:r>
+          </w:p>
+        </w:tc>
+        <w:tc>
+          <w:tcPr>
+            <w:tcW w:type="dxa" w:w="1568"/>
+          </w:tcPr>
+          <w:p>
+            <w:pPr>
+              <w:spacing w:line="240" w:lineRule="auto"/>
+            </w:pPr>
+            <w:r>
+              <w:rPr>
+                <w:sz w:val="20"/>
+              </w:rPr>
+              <w:t>58.71</w:t>
+            </w:r>
+          </w:p>
+        </w:tc>
+        <w:tc>
+          <w:tcPr>
+            <w:tcW w:type="dxa" w:w="1568"/>
+          </w:tcPr>
+          <w:p>
+            <w:pPr>
+              <w:spacing w:line="240" w:lineRule="auto"/>
+            </w:pPr>
+            <w:r>
+              <w:rPr>
+                <w:sz w:val="20"/>
+              </w:rPr>
+              <w:t>8.46</w:t>
+            </w:r>
+          </w:p>
+        </w:tc>
+      </w:tr>
+      <w:tr>
+        <w:tc>
+          <w:tcPr>
+            <w:tcW w:type="dxa" w:w="1568"/>
+          </w:tcPr>
+          <w:p>
+            <w:pPr>
+              <w:spacing w:line="240" w:lineRule="auto"/>
+            </w:pPr>
+            <w:r>
+              <w:rPr>
+                <w:sz w:val="20"/>
+              </w:rPr>
+              <w:t>iost</w:t>
+            </w:r>
+          </w:p>
+        </w:tc>
+        <w:tc>
+          <w:tcPr>
+            <w:tcW w:type="dxa" w:w="1568"/>
+          </w:tcPr>
+          <w:p>
+            <w:pPr>
+              <w:spacing w:line="240" w:lineRule="auto"/>
+            </w:pPr>
+            <w:r>
+              <w:rPr>
+                <w:sz w:val="20"/>
+              </w:rPr>
+              <w:t>twitter</w:t>
+            </w:r>
+          </w:p>
+        </w:tc>
+        <w:tc>
+          <w:tcPr>
+            <w:tcW w:type="dxa" w:w="1568"/>
+          </w:tcPr>
+          <w:p>
+            <w:pPr>
+              <w:spacing w:line="240" w:lineRule="auto"/>
+            </w:pPr>
+            <w:r>
+              <w:rPr>
+                <w:sz w:val="20"/>
+              </w:rPr>
+              <w:t>302</w:t>
+            </w:r>
+          </w:p>
+        </w:tc>
+        <w:tc>
+          <w:tcPr>
+            <w:tcW w:type="dxa" w:w="1568"/>
+          </w:tcPr>
+          <w:p>
+            <w:pPr>
+              <w:spacing w:line="240" w:lineRule="auto"/>
+            </w:pPr>
+            <w:r>
+              <w:rPr>
+                <w:sz w:val="20"/>
+              </w:rPr>
+              <w:t>2019-09</w:t>
+            </w:r>
+          </w:p>
+        </w:tc>
+        <w:tc>
+          <w:tcPr>
+            <w:tcW w:type="dxa" w:w="1568"/>
+          </w:tcPr>
+          <w:p>
+            <w:pPr>
+              <w:spacing w:line="240" w:lineRule="auto"/>
+            </w:pPr>
+            <w:r>
+              <w:rPr>
+                <w:sz w:val="20"/>
+              </w:rPr>
+              <w:t>58.74</w:t>
             </w:r>
           </w:p>
         </w:tc>
@@ -2683,7 +2815,7 @@
               <w:rPr>
                 <w:sz w:val="20"/>
               </w:rPr>
-              <w:t>tour</w:t>
+              <w:t>bcash</w:t>
             </w:r>
           </w:p>
         </w:tc>
@@ -2715,7 +2847,7 @@
               <w:rPr>
                 <w:sz w:val="20"/>
               </w:rPr>
-              <w:t>455</w:t>
+              <w:t>498</w:t>
             </w:r>
           </w:p>
         </w:tc>
@@ -2731,7 +2863,7 @@
               <w:rPr>
                 <w:sz w:val="20"/>
               </w:rPr>
-              <w:t>2018-08</w:t>
+              <w:t>2017-11</w:t>
             </w:r>
           </w:p>
         </w:tc>
@@ -2747,7 +2879,7 @@
               <w:rPr>
                 <w:sz w:val="20"/>
               </w:rPr>
-              <w:t>53.47</w:t>
+              <w:t>53.48</w:t>
             </w:r>
           </w:p>
         </w:tc>
@@ -2791,7 +2923,7 @@
         <w:jc w:val="both"/>
       </w:pPr>
       <w:r>
-        <w:t>The most frequent hashtags were #bitcoin (1,254,032), #btc (316,486), #crypto (266,887), #cryptocurrency (181,848), #ethereum (110,610), #eth (105,905), #blockchain (80,895), #binance (61,686).</w:t>
+        <w:t>The most frequent hashtags were #bitcoin (1,254,028), #btc (316,483), #crypto (266,886), #cryptocurrency (181,848), #ethereum (110,607), #eth (105,904), #blockchain (80,895), #binance (61,686).</w:t>
       </w:r>
     </w:p>
     <w:p>
@@ -2807,7 +2939,7 @@
         <w:jc w:val="both"/>
       </w:pPr>
       <w:r>
-        <w:t>The comparison with the dataset's own labels could not be used as a quality measure. In the ingested tweets, the 488,162 posts that carry a usable label all have the same label (neutral), so accuracy, precision, recall and F1 are not informative: there is no positive or negative reference class to score against. For these posts VADER assigned: negative 18.9 percent, neutral 27.8 percent, positive 53.3 percent. The Pearson correlation between the VADER compound score and the dataset's sentiment score was 0.052, which is also not evidence of agreement or disagreement because that score is not a polarity score. This is reported as a limitation of the reference labels, not as a measure of VADER's accuracy. A hand-labelled sample would be the appropriate next step.</w:t>
+        <w:t>The comparison with the dataset's own labels could not be used as a quality measure. In the ingested tweets, the 488,173 posts that carry a usable label all have the same label (neutral), so accuracy, precision, recall and F1 are not informative: there is no positive or negative reference class to score against. For these posts VADER assigned: negative 18.9 percent, neutral 27.8 percent, positive 53.3 percent. The Pearson correlation between the VADER compound score and the dataset's sentiment score was 0.052, which is also not evidence of agreement or disagreement because that score is not a polarity score. This is reported as a limitation of the reference labels, not as a measure of VADER's accuracy. A hand-labelled sample would be the appropriate next step.</w:t>
       </w:r>
     </w:p>
     <w:p>
@@ -3038,7 +3170,7 @@
               <w:rPr>
                 <w:sz w:val="20"/>
               </w:rPr>
-              <w:t>131.30</w:t>
+              <w:t>105.24</w:t>
             </w:r>
           </w:p>
         </w:tc>
@@ -3054,7 +3186,7 @@
               <w:rPr>
                 <w:sz w:val="20"/>
               </w:rPr>
-              <w:t>26.10</w:t>
+              <w:t>24.47</w:t>
             </w:r>
           </w:p>
         </w:tc>
@@ -3070,7 +3202,7 @@
               <w:rPr>
                 <w:sz w:val="20"/>
               </w:rPr>
-              <w:t>158.83</w:t>
+              <w:t>130.52</w:t>
             </w:r>
           </w:p>
         </w:tc>
@@ -3086,7 +3218,7 @@
               <w:rPr>
                 <w:sz w:val="20"/>
               </w:rPr>
-              <w:t>9,679.10</w:t>
+              <w:t>11,778.00</w:t>
             </w:r>
           </w:p>
         </w:tc>
@@ -3102,7 +3234,7 @@
               <w:rPr>
                 <w:sz w:val="20"/>
               </w:rPr>
-              <w:t>1.43</w:t>
+              <w:t>0.81</w:t>
             </w:r>
           </w:p>
         </w:tc>
@@ -3168,7 +3300,7 @@
               <w:rPr>
                 <w:sz w:val="20"/>
               </w:rPr>
-              <w:t>241.57</w:t>
+              <w:t>197.39</w:t>
             </w:r>
           </w:p>
         </w:tc>
@@ -3184,7 +3316,7 @@
               <w:rPr>
                 <w:sz w:val="20"/>
               </w:rPr>
-              <w:t>51.98</w:t>
+              <w:t>35.42</w:t>
             </w:r>
           </w:p>
         </w:tc>
@@ -3200,7 +3332,7 @@
               <w:rPr>
                 <w:sz w:val="20"/>
               </w:rPr>
-              <w:t>296.76</w:t>
+              <w:t>238.33</w:t>
             </w:r>
           </w:p>
         </w:tc>
@@ -3216,7 +3348,7 @@
               <w:rPr>
                 <w:sz w:val="20"/>
               </w:rPr>
-              <w:t>10,356.20</w:t>
+              <w:t>12,895.20</w:t>
             </w:r>
           </w:p>
         </w:tc>
@@ -3232,7 +3364,7 @@
               <w:rPr>
                 <w:sz w:val="20"/>
               </w:rPr>
-              <w:t>3.21</w:t>
+              <w:t>5.52</w:t>
             </w:r>
           </w:p>
         </w:tc>
@@ -3298,7 +3430,7 @@
               <w:rPr>
                 <w:sz w:val="20"/>
               </w:rPr>
-              <w:t>566.25</w:t>
+              <w:t>493.04</w:t>
             </w:r>
           </w:p>
         </w:tc>
@@ -3314,7 +3446,7 @@
               <w:rPr>
                 <w:sz w:val="20"/>
               </w:rPr>
-              <w:t>92.32</w:t>
+              <w:t>64.45</w:t>
             </w:r>
           </w:p>
         </w:tc>
@@ -3330,7 +3462,7 @@
               <w:rPr>
                 <w:sz w:val="20"/>
               </w:rPr>
-              <w:t>671.64</w:t>
+              <w:t>566.52</w:t>
             </w:r>
           </w:p>
         </w:tc>
@@ -3346,7 +3478,7 @@
               <w:rPr>
                 <w:sz w:val="20"/>
               </w:rPr>
-              <w:t>9,148.60</w:t>
+              <w:t>10,846.30</w:t>
             </w:r>
           </w:p>
         </w:tc>
@@ -3362,7 +3494,7 @@
               <w:rPr>
                 <w:sz w:val="20"/>
               </w:rPr>
-              <w:t>13.07</w:t>
+              <w:t>9.02</w:t>
             </w:r>
           </w:p>
         </w:tc>
@@ -3434,7 +3566,7 @@
         <w:jc w:val="both"/>
       </w:pPr>
       <w:r>
-        <w:t>Data volume grew by a factor of 4 from the smallest to the largest run. Execution time grew from 158.8 to 671.6 seconds, a factor of 4.23. This is close to proportional, so cost per record stays roughly constant and the pipeline scales linearly over this range. Throughput was 9,679 records per second at 25 percent and 9,149 at 100 percent.</w:t>
+        <w:t>Data volume grew by a factor of 4 from the smallest to the largest run. Execution time grew from 130.5 to 566.5 seconds, a factor of 4.34. This is close to proportional, so cost per record stays roughly constant and the pipeline scales linearly over this range. Throughput was 11,778 records per second at 25 percent and 10,846 at 100 percent.</w:t>
       </w:r>
     </w:p>
     <w:p>
@@ -3442,7 +3574,7 @@
         <w:jc w:val="both"/>
       </w:pPr>
       <w:r>
-        <w:t>The indexed count query took 1.425 seconds at 25 percent and 13.066 seconds at 100 percent. Query response time is small compared with processing time, which confirms that the sampling-key index does its job and that the cost of the pipeline lies in text processing and not in data access.</w:t>
+        <w:t>The indexed count query took 0.809 seconds at 25 percent and 9.022 seconds at 100 percent. Query response time is small compared with processing time, which confirms that the sampling-key index does its job and that the cost of the pipeline lies in text processing and not in data access.</w:t>
       </w:r>
     </w:p>
     <w:p>
@@ -3450,7 +3582,7 @@
         <w:jc w:val="both"/>
       </w:pPr>
       <w:r>
-        <w:t>Within the full run, loading, cleaning and scoring took 566.2 seconds and aggregation took 92.3 seconds. The scoring step is the largest cost because VADER is applied to every post in Python, which identifies it as the first candidate for optimisation.</w:t>
+        <w:t>Within the full run, loading, cleaning and scoring took 493.0 seconds and aggregation took 64.5 seconds. The scoring step is the largest cost because VADER is applied to every post in Python, which identifies it as the first candidate for optimisation.</w:t>
       </w:r>
     </w:p>
     <w:p>

</xml_diff>